<commit_message>
feat: add CRA role, CCRA status, Sacramento move, and docx downloads to findings site
Co-Authored-By: Claude Sonnet 5.5 <noreply@anthropic.com>
Claude-Session: https://claude.ai/code/session_017MCnjkXrDunu8R82jEPjBh
</commit_message>
<xml_diff>
--- a/applications/site/documents/abbvie-cra1-derm-cover-letter.docx
+++ b/applications/site/documents/abbvie-cra1-derm-cover-letter.docx
@@ -14,12 +14,12 @@
     </w:p>
     <w:p>
       <w:r>
-        <w:t>Before PA school I worked as a Clinical Research Associate, and I earned the CCRA credential in 2023. I completed four research assistant internships, including pharmacogenomics research in sickle cell anemia, MEG/EEG neuroscience research, and neuroimaging, and I am a co-author on two peer-reviewed publications (Pharmacogenomics, 2022; Mathematical Thinking and Learning, 2020). As a PA-C assessing 15–25 patients per shift in an emergency department, I also bring a clinician's view of the patient safety and clinical judgment that trials depend on. My CCRA credential has lapsed, and I plan to recertify.</w:t>
+        <w:t>From 2022 to 2023 I worked as a breast/oncology Clinical Research Associate at the IU Simon Comprehensive Cancer Center, and I earned the CCRA credential in 2023. I also completed four research assistant internships, including pharmacogenomics research in sickle cell anemia, MEG/EEG neuroscience research, and neuroimaging, and I am a co-author on two peer-reviewed publications (Pharmacogenomics, 2022; Mathematical Thinking and Learning, 2020). As a PA-C assessing 15–25 patients per shift in an emergency department, I also bring a clinician's view of the patient safety and clinical judgment that trials depend on. My CCRA credential has expired and recertification is in process.</w:t>
       </w:r>
     </w:p>
     <w:p>
       <w:r>
-        <w:t>AbbVie's dermatology CRA I role combines monitoring with a therapeutic area where I have clinical training from my dermatology rotation.</w:t>
+        <w:t>AbbVie's dermatology CRA I role fits my CRA experience and the clinical training from my dermatology rotation.</w:t>
       </w:r>
     </w:p>
     <w:p>

</xml_diff>